<commit_message>
Add site & infrastructure requirements question (now 9 points)
Added a ninth data point covering the production-site requirements the
supplier must specify: minimum plot area for 10/20/30k t/yr (incl. tank
farm and expansion), required electrical power (MW), water demand/source
and effluent treatment/discharge, gas/fuel and steam needs, tank-farm
volume, road/rail access and port proximity, sanitary buffer zone, and
foundation loads / largest-equipment dimensions for erection.

Co-Authored-By: Claude Opus 4.8 <noreply@anthropic.com>
Claude-Session: https://claude.ai/code/session_01KMpMivcZ9Nn7TrjWCAqheY
</commit_message>
<xml_diff>
--- a/waste-oil-balkans/dist/06_Zapros_dannyh_postavshchiku.docx
+++ b/waste-oil-balkans/dist/06_Zapros_dannyh_postavshchiku.docx
@@ -29,7 +29,7 @@
           <w:sz w:val="22"/>
           <w:szCs w:val="22"/>
         </w:rPr>
-        <w:t xml:space="preserve">Завод регенерации отработанного масла в базовое масло API Group II (Болгария). Данные необходимы для расчёта экономики проекта. Просьба ответить по всем восьми пунктам с указанием цифр.</w:t>
+        <w:t xml:space="preserve">Завод регенерации отработанного масла в базовое масло API Group II (Болгария). Данные необходимы для расчёта экономики проекта. Просьба ответить по всем девяти пунктам с указанием цифр.</w:t>
       </w:r>
     </w:p>
     <w:p>
@@ -398,6 +398,54 @@
       </w:pPr>
       <w:r>
         <w:t xml:space="preserve">По какой технологии достигается Group II — вакуумная дистилляция + адсорбционная доочистка или с узлом гидроочистки. Соответствие Group II по классификации API 1509 (действует в ЕС): насыщенные ≥90 %, сера ≤0,03 %, индекс вязкости 80–120. Стабильность этих параметров на нашем (более загрязнённом) сырье.</w:t>
+      </w:r>
+    </w:p>
+    <w:p>
+      <w:pPr>
+        <w:pBdr>
+          <w:bottom w:val="dotted" w:color="BBBBBB" w:sz="4" w:space="3"/>
+        </w:pBdr>
+        <w:spacing w:after="80" w:line="300"/>
+      </w:pPr>
+      <w:r>
+        <w:rPr>
+          <w:color w:val="999999"/>
+          <w:sz w:val="19"/>
+          <w:szCs w:val="19"/>
+        </w:rPr>
+        <w:t xml:space="preserve">Ответ:</w:t>
+      </w:r>
+    </w:p>
+    <w:p>
+      <w:pPr>
+        <w:spacing w:after="20" w:before="170" w:line="268"/>
+      </w:pPr>
+      <w:r>
+        <w:rPr>
+          <w:b/>
+          <w:bCs/>
+          <w:color w:val="1F3864"/>
+          <w:sz w:val="23"/>
+          <w:szCs w:val="23"/>
+        </w:rPr>
+        <w:t xml:space="preserve">9. </w:t>
+      </w:r>
+      <w:r>
+        <w:rPr>
+          <w:b/>
+          <w:bCs/>
+          <w:sz w:val="22"/>
+          <w:szCs w:val="22"/>
+        </w:rPr>
+        <w:t xml:space="preserve">Требования к производственной площадке и инфраструктуре.</w:t>
+      </w:r>
+    </w:p>
+    <w:p>
+      <w:pPr>
+        <w:spacing w:after="60" w:line="264"/>
+      </w:pPr>
+      <w:r>
+        <w:t xml:space="preserve">Минимальная площадь участка (га) для мощности 10 000 / 20 000 / 30 000 т/год, включая резервуарный парк и запас под расширение. Требуемая электрическая мощность (МВт). Потребность и источник воды, требования к очистке и сбросу стоков. Потребность в газе/топливе и паре. Требуемый объём резервуарного парка (сырьё и готовый продукт). Подъездные пути (авто, ж/д тупик), близость к порту. Необходимая санитарно-защитная зона (расстояние до жилья). Нагрузки на фундаменты и габариты/вес крупнейших аппаратов для монтажа.</w:t>
       </w:r>
     </w:p>
     <w:p>

</xml_diff>

<commit_message>
Add feedstock spec, uptime/maintenance, and waste questions (now 12)
- 10 Input feedstock requirements: accepted waste-oil quality (max water,
  sediment, chlorine, PCB, viscosity), required pretreatment, and how
  yield/quality change on dirtier feedstock.
- 11 Utilization & maintenance: real operating days/year, overhaul
  intervals, key-part and adsorbent/catalyst life, annual maintenance cost.
- 12 Production waste: quantity/type per tonne (spent adsorbent, sludge,
  heavy residue), composition and hazard class only - EU disposal routing
  is ours to handle, not the supplier's to answer.

Co-Authored-By: Claude Opus 4.8 <noreply@anthropic.com>
Claude-Session: https://claude.ai/code/session_01KMpMivcZ9Nn7TrjWCAqheY
</commit_message>
<xml_diff>
--- a/waste-oil-balkans/dist/06_Zapros_dannyh_postavshchiku.docx
+++ b/waste-oil-balkans/dist/06_Zapros_dannyh_postavshchiku.docx
@@ -29,7 +29,7 @@
           <w:sz w:val="22"/>
           <w:szCs w:val="22"/>
         </w:rPr>
-        <w:t xml:space="preserve">Завод регенерации отработанного масла в базовое масло API Group II (Болгария). Данные необходимы для расчёта экономики проекта. Просьба ответить по всем девяти пунктам с указанием цифр.</w:t>
+        <w:t xml:space="preserve">Завод регенерации отработанного масла в базовое масло API Group II (Болгария). Данные необходимы для расчёта экономики проекта. Просьба ответить по всем двенадцати пунктам с указанием цифр.</w:t>
       </w:r>
     </w:p>
     <w:p>
@@ -446,6 +446,150 @@
       </w:pPr>
       <w:r>
         <w:t xml:space="preserve">Минимальная площадь участка (га) для мощности 10 000 / 20 000 / 30 000 т/год, включая резервуарный парк и запас под расширение. Требуемая электрическая мощность (МВт). Потребность и источник воды, требования к очистке и сбросу стоков. Потребность в газе/топливе и паре. Требуемый объём резервуарного парка (сырьё и готовый продукт). Подъездные пути (авто, ж/д тупик), близость к порту. Необходимая санитарно-защитная зона (расстояние до жилья). Нагрузки на фундаменты и габариты/вес крупнейших аппаратов для монтажа.</w:t>
+      </w:r>
+    </w:p>
+    <w:p>
+      <w:pPr>
+        <w:pBdr>
+          <w:bottom w:val="dotted" w:color="BBBBBB" w:sz="4" w:space="3"/>
+        </w:pBdr>
+        <w:spacing w:after="80" w:line="300"/>
+      </w:pPr>
+      <w:r>
+        <w:rPr>
+          <w:color w:val="999999"/>
+          <w:sz w:val="19"/>
+          <w:szCs w:val="19"/>
+        </w:rPr>
+        <w:t xml:space="preserve">Ответ:</w:t>
+      </w:r>
+    </w:p>
+    <w:p>
+      <w:pPr>
+        <w:spacing w:after="20" w:before="170" w:line="268"/>
+      </w:pPr>
+      <w:r>
+        <w:rPr>
+          <w:b/>
+          <w:bCs/>
+          <w:color w:val="1F3864"/>
+          <w:sz w:val="23"/>
+          <w:szCs w:val="23"/>
+        </w:rPr>
+        <w:t xml:space="preserve">10. </w:t>
+      </w:r>
+      <w:r>
+        <w:rPr>
+          <w:b/>
+          <w:bCs/>
+          <w:sz w:val="22"/>
+          <w:szCs w:val="22"/>
+        </w:rPr>
+        <w:t xml:space="preserve">Требования к входному сырью.</w:t>
+      </w:r>
+    </w:p>
+    <w:p>
+      <w:pPr>
+        <w:spacing w:after="60" w:line="264"/>
+      </w:pPr>
+      <w:r>
+        <w:t xml:space="preserve">Какое отработанное масло принимает установка: максимальное содержание воды, механических примесей, хлора и PCB, диапазон вязкости. Необходимая предварительная подготовка сырья. Как изменяются выход и качество продукта при более загрязнённом сырье.</w:t>
+      </w:r>
+    </w:p>
+    <w:p>
+      <w:pPr>
+        <w:pBdr>
+          <w:bottom w:val="dotted" w:color="BBBBBB" w:sz="4" w:space="3"/>
+        </w:pBdr>
+        <w:spacing w:after="80" w:line="300"/>
+      </w:pPr>
+      <w:r>
+        <w:rPr>
+          <w:color w:val="999999"/>
+          <w:sz w:val="19"/>
+          <w:szCs w:val="19"/>
+        </w:rPr>
+        <w:t xml:space="preserve">Ответ:</w:t>
+      </w:r>
+    </w:p>
+    <w:p>
+      <w:pPr>
+        <w:spacing w:after="20" w:before="170" w:line="268"/>
+      </w:pPr>
+      <w:r>
+        <w:rPr>
+          <w:b/>
+          <w:bCs/>
+          <w:color w:val="1F3864"/>
+          <w:sz w:val="23"/>
+          <w:szCs w:val="23"/>
+        </w:rPr>
+        <w:t xml:space="preserve">11. </w:t>
+      </w:r>
+      <w:r>
+        <w:rPr>
+          <w:b/>
+          <w:bCs/>
+          <w:sz w:val="22"/>
+          <w:szCs w:val="22"/>
+        </w:rPr>
+        <w:t xml:space="preserve">Загрузка и обслуживание.</w:t>
+      </w:r>
+    </w:p>
+    <w:p>
+      <w:pPr>
+        <w:spacing w:after="60" w:line="264"/>
+      </w:pPr>
+      <w:r>
+        <w:t xml:space="preserve">Фактическое количество рабочих суток в году (с учётом плановых остановок). Межремонтные интервалы и ресурс ключевых узлов. Ресурс/срок службы адсорбента и катализатора. Годовые затраты на ТОиР.</w:t>
+      </w:r>
+    </w:p>
+    <w:p>
+      <w:pPr>
+        <w:pBdr>
+          <w:bottom w:val="dotted" w:color="BBBBBB" w:sz="4" w:space="3"/>
+        </w:pBdr>
+        <w:spacing w:after="80" w:line="300"/>
+      </w:pPr>
+      <w:r>
+        <w:rPr>
+          <w:color w:val="999999"/>
+          <w:sz w:val="19"/>
+          <w:szCs w:val="19"/>
+        </w:rPr>
+        <w:t xml:space="preserve">Ответ:</w:t>
+      </w:r>
+    </w:p>
+    <w:p>
+      <w:pPr>
+        <w:spacing w:after="20" w:before="170" w:line="268"/>
+      </w:pPr>
+      <w:r>
+        <w:rPr>
+          <w:b/>
+          <w:bCs/>
+          <w:color w:val="1F3864"/>
+          <w:sz w:val="23"/>
+          <w:szCs w:val="23"/>
+        </w:rPr>
+        <w:t xml:space="preserve">12. </w:t>
+      </w:r>
+      <w:r>
+        <w:rPr>
+          <w:b/>
+          <w:bCs/>
+          <w:sz w:val="22"/>
+          <w:szCs w:val="22"/>
+        </w:rPr>
+        <w:t xml:space="preserve">Отходы производства.</w:t>
+      </w:r>
+    </w:p>
+    <w:p>
+      <w:pPr>
+        <w:spacing w:after="60" w:line="264"/>
+      </w:pPr>
+      <w:r>
+        <w:t xml:space="preserve">Количество и вид отходов на 1 тонну переработки (отработанный адсорбент, шлам, тяжёлый остаток/гудрон), их состав и класс опасности. Способ утилизации в ЕС определяем сами — от вас нужны только объёмы и характеристики.</w:t>
       </w:r>
     </w:p>
     <w:p>

</xml_diff>